<commit_message>
Put the hardware back into the deck, analogy sheet and poster
Deck is 13 slides again: "The collar that watches the herd" returns at
badge 07 with the CN-01/LoRa/BS-01/API signal chain, the four sensors and
the bench photos; badges 08-12 shifted back. Journey step 2 is MONITOR
(the collar) rather than TRACK, the platform grid shows IoT Command
Center again, and the credibility slide shows Hardware design.

Analogy sheet is 11 again, with "the collar is a mufudzi who never
sleeps" restored at 05 — the one that actually gets repeated at a stand.
The audience picker and recall card point at it again.

Poster: the architecture diagram's bottom-right box is the IoT Layer once
more, with the telemetry and sensor-dashboard capability rows. PDF and
preview regenerated.

Co-Authored-By: Claude <noreply@anthropic.com>
</commit_message>
<xml_diff>
--- a/PFUMA_Analogy_Sheet.docx
+++ b/PFUMA_Analogy_Sheet.docx
@@ -309,7 +309,7 @@
           <w:sz w:val="19"/>
           <w:szCs w:val="19"/>
         </w:rPr>
-        <w:t xml:space="preserve">Agree with them. “They are — a car cannot get sick, and it cannot walk away on its own. That is why the book for cattle has to do more than a car book does.” That hands you the health record and the vet without you forcing the turn.</w:t>
+        <w:t xml:space="preserve">Agree with them. “They are — a car cannot get sick, and it cannot walk away on its own. That is why the book for cattle has to do more than a car book does.” That hands you the health record and the collar without you forcing the turn.</w:t>
       </w:r>
     </w:p>
     <w:p>
@@ -761,7 +761,7 @@
           <w:sz w:val="24"/>
           <w:szCs w:val="24"/>
         </w:rPr>
-        <w:t xml:space="preserve">JINDA — THE NEIGHBOUR WHO IS AWAKE AT 2AM</w:t>
+        <w:t xml:space="preserve">THE COLLAR — A HERDBOY WHO NEVER SLEEPS</w:t>
       </w:r>
     </w:p>
     <w:tbl>
@@ -810,7 +810,7 @@
                 <w:sz w:val="23"/>
                 <w:szCs w:val="23"/>
               </w:rPr>
-              <w:t xml:space="preserve">“Every area has that one old farmer who has seen every disease, and everyone walks to his homestead to ask. Jinda is him — except he is inside your phone, he answers in Shona, and he is awake at two in the morning when your beast starts shaking.”</w:t>
+              <w:t xml:space="preserve">“The collar is a mufudzi who never sleeps. He never gets tired, he never wanders off to a friend, and he can shout to you from ten kilometres away — the moment the animal runs a fever or crosses the boundary.”</w:t>
             </w:r>
           </w:p>
         </w:tc>
@@ -829,7 +829,7 @@
           <w:sz w:val="19"/>
           <w:szCs w:val="19"/>
         </w:rPr>
-        <w:t xml:space="preserve">Say the limit out loud.  </w:t>
+        <w:t xml:space="preserve">This is the one people repeat.  </w:t>
       </w:r>
       <w:r>
         <w:rPr>
@@ -838,7 +838,7 @@
           <w:sz w:val="19"/>
           <w:szCs w:val="19"/>
         </w:rPr>
-        <w:t xml:space="preserve">“He is not a vet, and he will tell you when to call one.” Saying it yourself is worth more than being caught on it.</w:t>
+        <w:t xml:space="preserve">It is the analogy that gets told to someone else later in the day. Use it with anyone who asks about the hardware.</w:t>
       </w:r>
     </w:p>
     <w:p>
@@ -854,7 +854,7 @@
           <w:sz w:val="19"/>
           <w:szCs w:val="19"/>
         </w:rPr>
-        <w:t xml:space="preserve">Avoid.  </w:t>
+        <w:t xml:space="preserve">If they want detail.  </w:t>
       </w:r>
       <w:r>
         <w:rPr>
@@ -863,7 +863,32 @@
           <w:sz w:val="19"/>
           <w:szCs w:val="19"/>
         </w:rPr>
-        <w:t xml:space="preserve">Do not describe it as “ChatGPT for farming” unless you want to spend your thirty seconds arguing about AI instead of about cattle.</w:t>
+        <w:t xml:space="preserve">“It reads temperature, heartbeat, movement and location, and it talks to a box at the homestead over long-range radio — so it works where there is no network at the kraal.”</w:t>
+      </w:r>
+    </w:p>
+    <w:p>
+      <w:pPr>
+        <w:spacing w:after="60" w:before="140" w:line="276"/>
+      </w:pPr>
+      <w:r>
+        <w:rPr>
+          <w:rFonts w:ascii="Calibri" w:cs="Calibri" w:eastAsia="Calibri" w:hAnsi="Calibri"/>
+          <w:b/>
+          <w:bCs/>
+          <w:color w:val="1B5E20"/>
+          <w:sz w:val="19"/>
+          <w:szCs w:val="19"/>
+        </w:rPr>
+        <w:t xml:space="preserve">If they ask whether it is real.  </w:t>
+      </w:r>
+      <w:r>
+        <w:rPr>
+          <w:rFonts w:ascii="Calibri" w:cs="Calibri" w:eastAsia="Calibri" w:hAnsi="Calibri"/>
+          <w:color w:val="2F3F33"/>
+          <w:sz w:val="19"/>
+          <w:szCs w:val="19"/>
+        </w:rPr>
+        <w:t xml:space="preserve">Show the parts. Real components, real wiring, real firmware — not a picture of an idea.</w:t>
       </w:r>
     </w:p>
     <w:p>
@@ -892,7 +917,7 @@
           <w:sz w:val="24"/>
           <w:szCs w:val="24"/>
         </w:rPr>
-        <w:t xml:space="preserve">THE BRAND MARK — A NUMBER PLATE</w:t>
+        <w:t xml:space="preserve">JINDA — THE NEIGHBOUR WHO IS AWAKE AT 2AM</w:t>
       </w:r>
     </w:p>
     <w:tbl>
@@ -941,7 +966,7 @@
                 <w:sz w:val="23"/>
                 <w:szCs w:val="23"/>
               </w:rPr>
-              <w:t xml:space="preserve">“A car with no number plate belongs to nobody the moment it is stolen. An unbranded beast is exactly the same. PFUMA records the brand and the tag, so the animal is carrying a plate.”</w:t>
+              <w:t xml:space="preserve">“Every area has that one old farmer who has seen every disease, and everyone walks to his homestead to ask. Jinda is him — except he is inside your phone, he answers in Shona, and he is awake at two in the morning when your beast starts shaking.”</w:t>
             </w:r>
           </w:p>
         </w:tc>
@@ -960,7 +985,7 @@
           <w:sz w:val="19"/>
           <w:szCs w:val="19"/>
         </w:rPr>
-        <w:t xml:space="preserve">Use it when.  </w:t>
+        <w:t xml:space="preserve">Say the limit out loud.  </w:t>
       </w:r>
       <w:r>
         <w:rPr>
@@ -969,7 +994,32 @@
           <w:sz w:val="19"/>
           <w:szCs w:val="19"/>
         </w:rPr>
-        <w:t xml:space="preserve">Explaining why the app flags “no brand on record” as a risk before a sale rather than quietly allowing it.</w:t>
+        <w:t xml:space="preserve">“He is not a vet, and he will tell you when to call one.” Saying it yourself is worth more than being caught on it.</w:t>
+      </w:r>
+    </w:p>
+    <w:p>
+      <w:pPr>
+        <w:spacing w:after="60" w:before="140" w:line="276"/>
+      </w:pPr>
+      <w:r>
+        <w:rPr>
+          <w:rFonts w:ascii="Calibri" w:cs="Calibri" w:eastAsia="Calibri" w:hAnsi="Calibri"/>
+          <w:b/>
+          <w:bCs/>
+          <w:color w:val="1B5E20"/>
+          <w:sz w:val="19"/>
+          <w:szCs w:val="19"/>
+        </w:rPr>
+        <w:t xml:space="preserve">Avoid.  </w:t>
+      </w:r>
+      <w:r>
+        <w:rPr>
+          <w:rFonts w:ascii="Calibri" w:cs="Calibri" w:eastAsia="Calibri" w:hAnsi="Calibri"/>
+          <w:color w:val="2F3F33"/>
+          <w:sz w:val="19"/>
+          <w:szCs w:val="19"/>
+        </w:rPr>
+        <w:t xml:space="preserve">Do not describe it as “ChatGPT for farming” unless you want to spend your thirty seconds arguing about AI instead of about cattle.</w:t>
       </w:r>
     </w:p>
     <w:p>
@@ -998,7 +1048,7 @@
           <w:sz w:val="24"/>
           <w:szCs w:val="24"/>
         </w:rPr>
-        <w:t xml:space="preserve">VERIFICATION — YOU CANNOT PRINT YOURSELF A UNIFORM</w:t>
+        <w:t xml:space="preserve">THE BRAND MARK — A NUMBER PLATE</w:t>
       </w:r>
     </w:p>
     <w:tbl>
@@ -1047,7 +1097,7 @@
                 <w:sz w:val="23"/>
                 <w:szCs w:val="23"/>
               </w:rPr>
-              <w:t xml:space="preserve">“Anyone can buy a uniform at the market. That is exactly why an officer cannot sign himself up on PFUMA — an already-verified officer has to bring him in, the same way the ZRP onboards its own. A vet is the same: another registered vet has to confirm him.”</w:t>
+              <w:t xml:space="preserve">“A car with no number plate belongs to nobody the moment it is stolen. An unbranded beast is exactly the same. PFUMA records the brand and the tag, so the animal is carrying a plate.”</w:t>
             </w:r>
           </w:p>
         </w:tc>
@@ -1075,32 +1125,7 @@
           <w:sz w:val="19"/>
           <w:szCs w:val="19"/>
         </w:rPr>
-        <w:t xml:space="preserve">Someone asks the sharpest question you will get all day — who stops a fake officer clearing fake sales.</w:t>
-      </w:r>
-    </w:p>
-    <w:p>
-      <w:pPr>
-        <w:spacing w:after="60" w:before="140" w:line="276"/>
-      </w:pPr>
-      <w:r>
-        <w:rPr>
-          <w:rFonts w:ascii="Calibri" w:cs="Calibri" w:eastAsia="Calibri" w:hAnsi="Calibri"/>
-          <w:b/>
-          <w:bCs/>
-          <w:color w:val="1B5E20"/>
-          <w:sz w:val="19"/>
-          <w:szCs w:val="19"/>
-        </w:rPr>
-        <w:t xml:space="preserve">Answer it straight.  </w:t>
-      </w:r>
-      <w:r>
-        <w:rPr>
-          <w:rFonts w:ascii="Calibri" w:cs="Calibri" w:eastAsia="Calibri" w:hAnsi="Calibri"/>
-          <w:color w:val="2F3F33"/>
-          <w:sz w:val="19"/>
-          <w:szCs w:val="19"/>
-        </w:rPr>
-        <w:t xml:space="preserve">Never wave this one away. The person asking it is the person most likely to actually use the platform.</w:t>
+        <w:t xml:space="preserve">Explaining why the app flags “no brand on record” as a risk before a sale rather than quietly allowing it.</w:t>
       </w:r>
     </w:p>
     <w:p>
@@ -1129,7 +1154,7 @@
           <w:sz w:val="24"/>
           <w:szCs w:val="24"/>
         </w:rPr>
-        <w:t xml:space="preserve">THE MARKETPLACE — A DEALER, NOT A CAR PARK</w:t>
+        <w:t xml:space="preserve">VERIFICATION — YOU CANNOT PRINT YOURSELF A UNIFORM</w:t>
       </w:r>
     </w:p>
     <w:tbl>
@@ -1178,7 +1203,7 @@
                 <w:sz w:val="23"/>
                 <w:szCs w:val="23"/>
               </w:rPr>
-              <w:t xml:space="preserve">“Buying cattle today is a stranger in a car park telling you it is his. On PFUMA it is a dealer standing there with the book in his hand. Same animal, completely different amount of risk.”</w:t>
+              <w:t xml:space="preserve">“Anyone can buy a uniform at the market. That is exactly why an officer cannot sign himself up on PFUMA — an already-verified officer has to bring him in, the same way the ZRP onboards its own. A vet is the same: another registered vet has to confirm him.”</w:t>
             </w:r>
           </w:p>
         </w:tc>
@@ -1197,7 +1222,7 @@
           <w:sz w:val="19"/>
           <w:szCs w:val="19"/>
         </w:rPr>
-        <w:t xml:space="preserve">For a buyer or retailer.  </w:t>
+        <w:t xml:space="preserve">Use it when.  </w:t>
       </w:r>
       <w:r>
         <w:rPr>
@@ -1206,7 +1231,32 @@
           <w:sz w:val="19"/>
           <w:szCs w:val="19"/>
         </w:rPr>
-        <w:t xml:space="preserve">Add the consequence: “Under our law, even a buyer who did not know can be treated as receiving stolen goods. The book protects you, not just the seller.”</w:t>
+        <w:t xml:space="preserve">Someone asks the sharpest question you will get all day — who stops a fake officer clearing fake sales.</w:t>
+      </w:r>
+    </w:p>
+    <w:p>
+      <w:pPr>
+        <w:spacing w:after="60" w:before="140" w:line="276"/>
+      </w:pPr>
+      <w:r>
+        <w:rPr>
+          <w:rFonts w:ascii="Calibri" w:cs="Calibri" w:eastAsia="Calibri" w:hAnsi="Calibri"/>
+          <w:b/>
+          <w:bCs/>
+          <w:color w:val="1B5E20"/>
+          <w:sz w:val="19"/>
+          <w:szCs w:val="19"/>
+        </w:rPr>
+        <w:t xml:space="preserve">Answer it straight.  </w:t>
+      </w:r>
+      <w:r>
+        <w:rPr>
+          <w:rFonts w:ascii="Calibri" w:cs="Calibri" w:eastAsia="Calibri" w:hAnsi="Calibri"/>
+          <w:color w:val="2F3F33"/>
+          <w:sz w:val="19"/>
+          <w:szCs w:val="19"/>
+        </w:rPr>
+        <w:t xml:space="preserve">Never wave this one away. The person asking it is the person most likely to actually use the platform.</w:t>
       </w:r>
     </w:p>
     <w:p>
@@ -1235,7 +1285,7 @@
           <w:sz w:val="24"/>
           <w:szCs w:val="24"/>
         </w:rPr>
-        <w:t xml:space="preserve">DISEASE SURVEILLANCE — THE WEATHER REPORT</w:t>
+        <w:t xml:space="preserve">THE MARKETPLACE — A DEALER, NOT A CAR PARK</w:t>
       </w:r>
     </w:p>
     <w:tbl>
@@ -1284,7 +1334,7 @@
                 <w:sz w:val="23"/>
                 <w:szCs w:val="23"/>
               </w:rPr>
-              <w:t xml:space="preserve">“One farmer seeing three sick beasts knows nothing. A hundred farmers reporting is a weather report — the vets can see the storm coming and warn the next district before it arrives.”</w:t>
+              <w:t xml:space="preserve">“Buying cattle today is a stranger in a car park telling you it is his. On PFUMA it is a dealer standing there with the book in his hand. Same animal, completely different amount of risk.”</w:t>
             </w:r>
           </w:p>
         </w:tc>
@@ -1303,7 +1353,7 @@
           <w:sz w:val="19"/>
           <w:szCs w:val="19"/>
         </w:rPr>
-        <w:t xml:space="preserve">For a vet or a DVS officer.  </w:t>
+        <w:t xml:space="preserve">For a buyer or retailer.  </w:t>
       </w:r>
       <w:r>
         <w:rPr>
@@ -1312,7 +1362,7 @@
           <w:sz w:val="19"/>
           <w:szCs w:val="19"/>
         </w:rPr>
-        <w:t xml:space="preserve">This is their pitch, not the farmer's. Say “province and district tagging” and they will understand immediately what data they are being offered.</w:t>
+        <w:t xml:space="preserve">Add the consequence: “Under our law, even a buyer who did not know can be treated as receiving stolen goods. The book protects you, not just the seller.”</w:t>
       </w:r>
     </w:p>
     <w:p>
@@ -1330,6 +1380,112 @@
           <w:szCs w:val="24"/>
         </w:rPr>
         <w:t xml:space="preserve">10   </w:t>
+      </w:r>
+      <w:r>
+        <w:rPr>
+          <w:rFonts w:ascii="Cambria" w:cs="Cambria" w:eastAsia="Cambria" w:hAnsi="Cambria"/>
+          <w:b/>
+          <w:bCs/>
+          <w:color w:val="1B5E20"/>
+          <w:spacing w:val="8"/>
+          <w:sz w:val="24"/>
+          <w:szCs w:val="24"/>
+        </w:rPr>
+        <w:t xml:space="preserve">DISEASE SURVEILLANCE — THE WEATHER REPORT</w:t>
+      </w:r>
+    </w:p>
+    <w:tbl>
+      <w:tblPr>
+        <w:tblW w:type="dxa" w:w="9460"/>
+        <w:tblBorders>
+          <w:top w:val="none" w:color="FFFFFF" w:sz="0"/>
+          <w:left w:val="none" w:color="FFFFFF" w:sz="0"/>
+          <w:bottom w:val="none" w:color="FFFFFF" w:sz="0"/>
+          <w:right w:val="none" w:color="FFFFFF" w:sz="0"/>
+          <w:insideH w:val="single" w:color="auto" w:sz="4"/>
+          <w:insideV w:val="single" w:color="auto" w:sz="4"/>
+        </w:tblBorders>
+      </w:tblPr>
+      <w:tblGrid>
+        <w:gridCol w:w="9460"/>
+      </w:tblGrid>
+      <w:tr>
+        <w:tc>
+          <w:tcPr>
+            <w:tcW w:type="dxa" w:w="9460"/>
+            <w:tcBorders>
+              <w:top w:val="none" w:color="FFFFFF" w:sz="0"/>
+              <w:left w:val="none" w:color="FFFFFF" w:sz="0"/>
+              <w:bottom w:val="none" w:color="FFFFFF" w:sz="0"/>
+              <w:right w:val="none" w:color="FFFFFF" w:sz="0"/>
+            </w:tcBorders>
+            <w:shd w:fill="EAF4EC" w:color="auto" w:val="clear"/>
+            <w:tcMar>
+              <w:top w:type="dxa" w:w="160"/>
+              <w:left w:type="dxa" w:w="220"/>
+              <w:bottom w:type="dxa" w:w="160"/>
+              <w:right w:type="dxa" w:w="220"/>
+            </w:tcMar>
+          </w:tcPr>
+          <w:p>
+            <w:pPr>
+              <w:spacing w:after="0" w:line="300"/>
+            </w:pPr>
+            <w:r>
+              <w:rPr>
+                <w:rFonts w:ascii="Cambria" w:cs="Cambria" w:eastAsia="Cambria" w:hAnsi="Cambria"/>
+                <w:i/>
+                <w:iCs/>
+                <w:color w:val="14290F"/>
+                <w:sz w:val="23"/>
+                <w:szCs w:val="23"/>
+              </w:rPr>
+              <w:t xml:space="preserve">“One farmer seeing three sick beasts knows nothing. A hundred farmers reporting is a weather report — the vets can see the storm coming and warn the next district before it arrives.”</w:t>
+            </w:r>
+          </w:p>
+        </w:tc>
+      </w:tr>
+    </w:tbl>
+    <w:p>
+      <w:pPr>
+        <w:spacing w:after="60" w:before="140" w:line="276"/>
+      </w:pPr>
+      <w:r>
+        <w:rPr>
+          <w:rFonts w:ascii="Calibri" w:cs="Calibri" w:eastAsia="Calibri" w:hAnsi="Calibri"/>
+          <w:b/>
+          <w:bCs/>
+          <w:color w:val="1B5E20"/>
+          <w:sz w:val="19"/>
+          <w:szCs w:val="19"/>
+        </w:rPr>
+        <w:t xml:space="preserve">For a vet or a DVS officer.  </w:t>
+      </w:r>
+      <w:r>
+        <w:rPr>
+          <w:rFonts w:ascii="Calibri" w:cs="Calibri" w:eastAsia="Calibri" w:hAnsi="Calibri"/>
+          <w:color w:val="2F3F33"/>
+          <w:sz w:val="19"/>
+          <w:szCs w:val="19"/>
+        </w:rPr>
+        <w:t xml:space="preserve">This is their pitch, not the farmer's. Say “province and district tagging” and they will understand immediately what data they are being offered.</w:t>
+      </w:r>
+    </w:p>
+    <w:p>
+      <w:pPr>
+        <w:pStyle w:val="Heading2"/>
+        <w:spacing w:after="100" w:before="320"/>
+      </w:pPr>
+      <w:r>
+        <w:rPr>
+          <w:rFonts w:ascii="Cambria" w:cs="Cambria" w:eastAsia="Cambria" w:hAnsi="Cambria"/>
+          <w:b/>
+          <w:bCs/>
+          <w:color w:val="8A6100"/>
+          <w:sz w:val="24"/>
+          <w:szCs w:val="24"/>
+        </w:rPr>
+        <w:t xml:space="preserve">11   </w:t>
       </w:r>
       <w:r>
         <w:rPr>
@@ -1687,7 +1843,7 @@
                 <w:sz w:val="19"/>
                 <w:szCs w:val="19"/>
               </w:rPr>
-              <w:t xml:space="preserve">The number plate (06)</w:t>
+              <w:t xml:space="preserve">The herdboy who never sleeps (05)</w:t>
             </w:r>
           </w:p>
         </w:tc>
@@ -1791,7 +1947,7 @@
                 <w:sz w:val="19"/>
                 <w:szCs w:val="19"/>
               </w:rPr>
-              <w:t xml:space="preserve">The weather report (09)</w:t>
+              <w:t xml:space="preserve">The weather report (10)</w:t>
             </w:r>
           </w:p>
         </w:tc>
@@ -1861,7 +2017,7 @@
                 <w:sz w:val="19"/>
                 <w:szCs w:val="19"/>
               </w:rPr>
-              <w:t xml:space="preserve">The dealer, not a car park (08)</w:t>
+              <w:t xml:space="preserve">The dealer, not a car park (09)</w:t>
             </w:r>
           </w:p>
         </w:tc>
@@ -1999,7 +2155,7 @@
                 <w:sz w:val="19"/>
                 <w:szCs w:val="19"/>
               </w:rPr>
-              <w:t xml:space="preserve">You cannot print a uniform (07)</w:t>
+              <w:t xml:space="preserve">You cannot print a uniform (08)</w:t>
             </w:r>
           </w:p>
         </w:tc>
@@ -2069,7 +2225,7 @@
                 <w:sz w:val="19"/>
                 <w:szCs w:val="19"/>
               </w:rPr>
-              <w:t xml:space="preserve">The dip tank on your phone (10)</w:t>
+              <w:t xml:space="preserve">The dip tank on your phone (11)</w:t>
             </w:r>
           </w:p>
         </w:tc>
@@ -2277,7 +2433,7 @@
                 <w:sz w:val="19"/>
                 <w:szCs w:val="19"/>
               </w:rPr>
-              <w:t xml:space="preserve">The dip tank on your phone (10)</w:t>
+              <w:t xml:space="preserve">The herdboy who never sleeps (05)</w:t>
             </w:r>
           </w:p>
         </w:tc>
@@ -2311,7 +2467,7 @@
                 <w:sz w:val="19"/>
                 <w:szCs w:val="19"/>
               </w:rPr>
-              <w:t xml:space="preserve">The neighbour awake at 2am (05)</w:t>
+              <w:t xml:space="preserve">The neighbour awake at 2am (06)</w:t>
             </w:r>
           </w:p>
         </w:tc>
@@ -2381,7 +2537,7 @@
                 <w:sz w:val="19"/>
                 <w:szCs w:val="19"/>
               </w:rPr>
-              <w:t xml:space="preserve">The dip tank on your phone (10)</w:t>
+              <w:t xml:space="preserve">The dip tank on your phone (11)</w:t>
             </w:r>
           </w:p>
         </w:tc>
@@ -2415,7 +2571,7 @@
                 <w:sz w:val="19"/>
                 <w:szCs w:val="19"/>
               </w:rPr>
-              <w:t xml:space="preserve">The weather report (09)</w:t>
+              <w:t xml:space="preserve">The weather report (10)</w:t>
             </w:r>
           </w:p>
         </w:tc>
@@ -3769,7 +3925,7 @@
                 <w:sz w:val="19"/>
                 <w:szCs w:val="19"/>
               </w:rPr>
-              <w:t xml:space="preserve">Neighbour awake at 2am</w:t>
+              <w:t xml:space="preserve">Herdboy who never sleeps</w:t>
             </w:r>
           </w:p>
         </w:tc>
@@ -3803,7 +3959,7 @@
                 <w:sz w:val="19"/>
                 <w:szCs w:val="19"/>
               </w:rPr>
-              <w:t xml:space="preserve">The old farmer who knows every disease</w:t>
+              <w:t xml:space="preserve">Shouts to you from ten kilometres</w:t>
             </w:r>
           </w:p>
         </w:tc>
@@ -3837,7 +3993,7 @@
                 <w:sz w:val="19"/>
                 <w:szCs w:val="19"/>
               </w:rPr>
-              <w:t xml:space="preserve">Jinda, the AI assistant</w:t>
+              <w:t xml:space="preserve">The IoT collar</w:t>
             </w:r>
           </w:p>
         </w:tc>
@@ -3873,7 +4029,7 @@
                 <w:sz w:val="19"/>
                 <w:szCs w:val="19"/>
               </w:rPr>
-              <w:t xml:space="preserve">Number plate</w:t>
+              <w:t xml:space="preserve">Neighbour awake at 2am</w:t>
             </w:r>
           </w:p>
         </w:tc>
@@ -3907,7 +4063,7 @@
                 <w:sz w:val="19"/>
                 <w:szCs w:val="19"/>
               </w:rPr>
-              <w:t xml:space="preserve">No plate, nobody's car</w:t>
+              <w:t xml:space="preserve">The old farmer who knows every disease</w:t>
             </w:r>
           </w:p>
         </w:tc>
@@ -3941,7 +4097,7 @@
                 <w:sz w:val="19"/>
                 <w:szCs w:val="19"/>
               </w:rPr>
-              <w:t xml:space="preserve">Brand mark and tag ID</w:t>
+              <w:t xml:space="preserve">Jinda, the AI assistant</w:t>
             </w:r>
           </w:p>
         </w:tc>
@@ -3977,7 +4133,7 @@
                 <w:sz w:val="19"/>
                 <w:szCs w:val="19"/>
               </w:rPr>
-              <w:t xml:space="preserve">Cannot print a uniform</w:t>
+              <w:t xml:space="preserve">Number plate</w:t>
             </w:r>
           </w:p>
         </w:tc>
@@ -4011,7 +4167,7 @@
                 <w:sz w:val="19"/>
                 <w:szCs w:val="19"/>
               </w:rPr>
-              <w:t xml:space="preserve">An officer must be brought in by an officer</w:t>
+              <w:t xml:space="preserve">No plate, nobody's car</w:t>
             </w:r>
           </w:p>
         </w:tc>
@@ -4045,7 +4201,7 @@
                 <w:sz w:val="19"/>
                 <w:szCs w:val="19"/>
               </w:rPr>
-              <w:t xml:space="preserve">Signup verification</w:t>
+              <w:t xml:space="preserve">Brand mark and tag ID</w:t>
             </w:r>
           </w:p>
         </w:tc>
@@ -4081,7 +4237,7 @@
                 <w:sz w:val="19"/>
                 <w:szCs w:val="19"/>
               </w:rPr>
-              <w:t xml:space="preserve">Dealer, not a car park</w:t>
+              <w:t xml:space="preserve">Cannot print a uniform</w:t>
             </w:r>
           </w:p>
         </w:tc>
@@ -4115,7 +4271,7 @@
                 <w:sz w:val="19"/>
                 <w:szCs w:val="19"/>
               </w:rPr>
-              <w:t xml:space="preserve">The book is in his hand</w:t>
+              <w:t xml:space="preserve">An officer must be brought in by an officer</w:t>
             </w:r>
           </w:p>
         </w:tc>
@@ -4149,7 +4305,7 @@
                 <w:sz w:val="19"/>
                 <w:szCs w:val="19"/>
               </w:rPr>
-              <w:t xml:space="preserve">The marketplace</w:t>
+              <w:t xml:space="preserve">Signup verification</w:t>
             </w:r>
           </w:p>
         </w:tc>
@@ -4185,7 +4341,7 @@
                 <w:sz w:val="19"/>
                 <w:szCs w:val="19"/>
               </w:rPr>
-              <w:t xml:space="preserve">Weather report</w:t>
+              <w:t xml:space="preserve">Dealer, not a car park</w:t>
             </w:r>
           </w:p>
         </w:tc>
@@ -4219,7 +4375,7 @@
                 <w:sz w:val="19"/>
                 <w:szCs w:val="19"/>
               </w:rPr>
-              <w:t xml:space="preserve">A hundred farmers make a forecast</w:t>
+              <w:t xml:space="preserve">The book is in his hand</w:t>
             </w:r>
           </w:p>
         </w:tc>
@@ -4253,7 +4409,7 @@
                 <w:sz w:val="19"/>
                 <w:szCs w:val="19"/>
               </w:rPr>
-              <w:t xml:space="preserve">Disease surveillance</w:t>
+              <w:t xml:space="preserve">The marketplace</w:t>
             </w:r>
           </w:p>
         </w:tc>
@@ -4289,7 +4445,7 @@
                 <w:sz w:val="19"/>
                 <w:szCs w:val="19"/>
               </w:rPr>
-              <w:t xml:space="preserve">Dip tank on your phone</w:t>
+              <w:t xml:space="preserve">Weather report</w:t>
             </w:r>
           </w:p>
         </w:tc>
@@ -4323,6 +4479,110 @@
                 <w:sz w:val="19"/>
                 <w:szCs w:val="19"/>
               </w:rPr>
+              <w:t xml:space="preserve">A hundred farmers make a forecast</w:t>
+            </w:r>
+          </w:p>
+        </w:tc>
+        <w:tc>
+          <w:tcPr>
+            <w:tcW w:type="dxa" w:w="3000"/>
+            <w:tcBorders>
+              <w:top w:val="single" w:color="CFE0D4" w:sz="2"/>
+              <w:left w:val="none" w:color="FFFFFF" w:sz="0"/>
+              <w:bottom w:val="single" w:color="CFE0D4" w:sz="2"/>
+              <w:right w:val="none" w:color="FFFFFF" w:sz="0"/>
+            </w:tcBorders>
+            <w:shd w:fill="F1F7F2" w:color="auto" w:val="clear"/>
+            <w:tcMar>
+              <w:top w:type="dxa" w:w="110"/>
+              <w:left w:type="dxa" w:w="150"/>
+              <w:bottom w:type="dxa" w:w="110"/>
+              <w:right w:type="dxa" w:w="150"/>
+            </w:tcMar>
+          </w:tcPr>
+          <w:p>
+            <w:pPr>
+              <w:spacing w:after="0" w:line="264"/>
+            </w:pPr>
+            <w:r>
+              <w:rPr>
+                <w:rFonts w:ascii="Calibri" w:cs="Calibri" w:eastAsia="Calibri" w:hAnsi="Calibri"/>
+                <w:b w:val="false"/>
+                <w:bCs w:val="false"/>
+                <w:color w:val="2F3F33"/>
+                <w:sz w:val="19"/>
+                <w:szCs w:val="19"/>
+              </w:rPr>
+              <w:t xml:space="preserve">Disease surveillance</w:t>
+            </w:r>
+          </w:p>
+        </w:tc>
+      </w:tr>
+      <w:tr>
+        <w:tc>
+          <w:tcPr>
+            <w:tcW w:type="dxa" w:w="2400"/>
+            <w:tcBorders>
+              <w:top w:val="single" w:color="CFE0D4" w:sz="2"/>
+              <w:left w:val="none" w:color="FFFFFF" w:sz="0"/>
+              <w:bottom w:val="single" w:color="CFE0D4" w:sz="2"/>
+              <w:right w:val="none" w:color="FFFFFF" w:sz="0"/>
+            </w:tcBorders>
+            <w:shd w:fill="FFFFFF" w:color="auto" w:val="clear"/>
+            <w:tcMar>
+              <w:top w:type="dxa" w:w="110"/>
+              <w:left w:type="dxa" w:w="150"/>
+              <w:bottom w:type="dxa" w:w="110"/>
+              <w:right w:type="dxa" w:w="150"/>
+            </w:tcMar>
+          </w:tcPr>
+          <w:p>
+            <w:pPr>
+              <w:spacing w:after="0" w:line="264"/>
+            </w:pPr>
+            <w:r>
+              <w:rPr>
+                <w:rFonts w:ascii="Calibri" w:cs="Calibri" w:eastAsia="Calibri" w:hAnsi="Calibri"/>
+                <w:b/>
+                <w:bCs/>
+                <w:color w:val="1B5E20"/>
+                <w:sz w:val="19"/>
+                <w:szCs w:val="19"/>
+              </w:rPr>
+              <w:t xml:space="preserve">Dip tank on your phone</w:t>
+            </w:r>
+          </w:p>
+        </w:tc>
+        <w:tc>
+          <w:tcPr>
+            <w:tcW w:type="dxa" w:w="4060"/>
+            <w:tcBorders>
+              <w:top w:val="single" w:color="CFE0D4" w:sz="2"/>
+              <w:left w:val="none" w:color="FFFFFF" w:sz="0"/>
+              <w:bottom w:val="single" w:color="CFE0D4" w:sz="2"/>
+              <w:right w:val="none" w:color="FFFFFF" w:sz="0"/>
+            </w:tcBorders>
+            <w:shd w:fill="FFFFFF" w:color="auto" w:val="clear"/>
+            <w:tcMar>
+              <w:top w:type="dxa" w:w="110"/>
+              <w:left w:type="dxa" w:w="150"/>
+              <w:bottom w:type="dxa" w:w="110"/>
+              <w:right w:type="dxa" w:w="150"/>
+            </w:tcMar>
+          </w:tcPr>
+          <w:p>
+            <w:pPr>
+              <w:spacing w:after="0" w:line="264"/>
+            </w:pPr>
+            <w:r>
+              <w:rPr>
+                <w:rFonts w:ascii="Calibri" w:cs="Calibri" w:eastAsia="Calibri" w:hAnsi="Calibri"/>
+                <w:b w:val="false"/>
+                <w:bCs w:val="false"/>
+                <w:color w:val="2F3F33"/>
+                <w:sz w:val="19"/>
+                <w:szCs w:val="19"/>
+              </w:rPr>
               <w:t xml:space="preserve">Same register, without the walk</w:t>
             </w:r>
           </w:p>
@@ -4336,7 +4596,7 @@
               <w:bottom w:val="single" w:color="CFE0D4" w:sz="2"/>
               <w:right w:val="none" w:color="FFFFFF" w:sz="0"/>
             </w:tcBorders>
-            <w:shd w:fill="F1F7F2" w:color="auto" w:val="clear"/>
+            <w:shd w:fill="FFFFFF" w:color="auto" w:val="clear"/>
             <w:tcMar>
               <w:top w:type="dxa" w:w="110"/>
               <w:left w:type="dxa" w:w="150"/>

</xml_diff>